<commit_message>
fix(weekly-plan): render subject rows across matching columns
Update the Weekly Plan Word templates to use row-level docxtpl
iteration for learning objectives, ensuring each subject and objective
is rendered in separate cells under the correct table headers.

Co-authored-by: Copilot <223556219+Copilot@users.noreply.github.com>
</commit_message>
<xml_diff>
--- a/fast-api-middleware/app/features/weekly_plan/templates/weekly_plan_template.docx
+++ b/fast-api-middleware/app/features/weekly_plan/templates/weekly_plan_template.docx
@@ -1,5 +1,87 @@
 
-<file path=word/document.xml><?xml version="1.0" encoding="utf-8"?>
+<file path=customXml\item1.xml><?xml version="1.0" encoding="utf-8"?>
+<b:Sources xmlns:b="http://schemas.openxmlformats.org/officeDocument/2006/bibliography" xmlns="http://schemas.openxmlformats.org/officeDocument/2006/bibliography" SelectedStyle="\APASixthEditionOfficeOnline.xsl" StyleName="APA" Version="6"/>
+</file>
+
+<file path=customXml\itemProps1.xml><?xml version="1.0" encoding="utf-8"?>
+<ds:datastoreItem xmlns:ds="http://schemas.openxmlformats.org/officeDocument/2006/customXml" ds:itemID="{180C964A-8B4F-403A-92FC-EA381371D074}">
+  <ds:schemaRefs>
+    <ds:schemaRef ds:uri="http://schemas.openxmlformats.org/officeDocument/2006/bibliography"/>
+  </ds:schemaRefs>
+</ds:datastoreItem>
+</file>
+
+<file path=docProps\app.xml><?xml version="1.0" encoding="utf-8"?>
+<Properties xmlns="http://schemas.openxmlformats.org/officeDocument/2006/extended-properties" xmlns:vt="http://schemas.openxmlformats.org/officeDocument/2006/docPropsVTypes">
+  <Template>Normal.dotm</Template>
+  <TotalTime>135</TotalTime>
+  <Pages>2</Pages>
+  <Words>227</Words>
+  <Characters>1296</Characters>
+  <Application>Microsoft Office Word</Application>
+  <DocSecurity>0</DocSecurity>
+  <Lines>10</Lines>
+  <Paragraphs>3</Paragraphs>
+  <ScaleCrop>false</ScaleCrop>
+  <HeadingPairs>
+    <vt:vector size="2" baseType="variant">
+      <vt:variant>
+        <vt:lpstr>Title</vt:lpstr>
+      </vt:variant>
+      <vt:variant>
+        <vt:i4>1</vt:i4>
+      </vt:variant>
+    </vt:vector>
+  </HeadingPairs>
+  <TitlesOfParts>
+    <vt:vector size="1" baseType="lpstr">
+      <vt:lpstr/>
+    </vt:vector>
+  </TitlesOfParts>
+  <Company/>
+  <LinksUpToDate>false</LinksUpToDate>
+  <CharactersWithSpaces>1520</CharactersWithSpaces>
+  <SharedDoc>false</SharedDoc>
+  <HyperlinksChanged>false</HyperlinksChanged>
+  <AppVersion>16.0000</AppVersion>
+</Properties>
+</file>
+
+<file path=docProps\core.xml><?xml version="1.0" encoding="utf-8"?>
+<cp:coreProperties xmlns:cp="http://schemas.openxmlformats.org/package/2006/metadata/core-properties" xmlns:dc="http://purl.org/dc/elements/1.1/" xmlns:dcterms="http://purl.org/dc/terms/" xmlns:dcmitype="http://purl.org/dc/dcmitype/" xmlns:xsi="http://www.w3.org/2001/XMLSchema-instance">
+  <dc:title/>
+  <dc:subject/>
+  <dc:creator>AHMAD RIYADH ALMALIKI</dc:creator>
+  <cp:keywords/>
+  <dc:description/>
+  <cp:lastModifiedBy>AHMAD RIYADH ALMALIKI</cp:lastModifiedBy>
+  <cp:revision>4</cp:revision>
+  <dcterms:created xsi:type="dcterms:W3CDTF">2026-09-21T08:22:00Z</dcterms:created>
+  <dcterms:modified xsi:type="dcterms:W3CDTF">2026-09-22T04:10:00Z</dcterms:modified>
+</cp:coreProperties>
+</file>
+
+<file path=docProps\custom.xml><?xml version="1.0" encoding="utf-8"?>
+<Properties xmlns="http://schemas.openxmlformats.org/officeDocument/2006/custom-properties" xmlns:vt="http://schemas.openxmlformats.org/officeDocument/2006/docPropsVTypes">
+  <property fmtid="{D5CDD505-2E9C-101B-9397-08002B2CF9AE}" pid="2" name="Converter">
+    <vt:lpwstr>SolidFramework v10.0.19910.1</vt:lpwstr>
+  </property>
+  <property fmtid="{D5CDD505-2E9C-101B-9397-08002B2CF9AE}" pid="3" name="Created">
+    <vt:filetime>2026-07-09T00:00:00Z</vt:filetime>
+  </property>
+  <property fmtid="{D5CDD505-2E9C-101B-9397-08002B2CF9AE}" pid="4" name="Creator">
+    <vt:lpwstr>wkhtmltopdf 0.12.6.1</vt:lpwstr>
+  </property>
+  <property fmtid="{D5CDD505-2E9C-101B-9397-08002B2CF9AE}" pid="5" name="Producer">
+    <vt:lpwstr>Qt 4.8.7</vt:lpwstr>
+  </property>
+  <property fmtid="{D5CDD505-2E9C-101B-9397-08002B2CF9AE}" pid="6" name="LastSaved">
+    <vt:filetime>2026-07-09T00:00:00Z</vt:filetime>
+  </property>
+</Properties>
+</file>
+
+<file path=word\document.xml><?xml version="1.0" encoding="utf-8"?>
 <w:document xmlns:wpc="http://schemas.microsoft.com/office/word/2010/wordprocessingCanvas" xmlns:cx="http://schemas.microsoft.com/office/drawing/2014/chartex" xmlns:cx1="http://schemas.microsoft.com/office/drawing/2015/9/8/chartex" xmlns:cx2="http://schemas.microsoft.com/office/drawing/2015/10/21/chartex" xmlns:cx3="http://schemas.microsoft.com/office/drawing/2016/5/9/chartex" xmlns:cx4="http://schemas.microsoft.com/office/drawing/2016/5/10/chartex" xmlns:cx5="http://schemas.microsoft.com/office/drawing/2016/5/11/chartex" xmlns:cx6="http://schemas.microsoft.com/office/drawing/2016/5/12/chartex" xmlns:cx7="http://schemas.microsoft.com/office/drawing/2016/5/13/chartex" xmlns:cx8="http://schemas.microsoft.com/office/drawing/2016/5/14/chartex" xmlns:mc="http://schemas.openxmlformats.org/markup-compatibility/2006" xmlns:aink="http://schemas.microsoft.com/office/drawing/2016/ink" xmlns:am3d="http://schemas.microsoft.com/office/drawing/2017/model3d" xmlns:o="urn:schemas-microsoft-com:office:office" xmlns:oel="http://schemas.microsoft.com/office/2019/extlst" xmlns:r="http://schemas.openxmlformats.org/officeDocument/2006/relationships" xmlns:m="http://schemas.openxmlformats.org/officeDocument/2006/math" xmlns:v="urn:schemas-microsoft-com:vml" xmlns:wp14="http://schemas.microsoft.com/office/word/2010/wordprocessingDrawing" xmlns:wp="http://schemas.openxmlformats.org/drawingml/2006/wordprocessingDrawing" xmlns:w10="urn:schemas-microsoft-com:office:word" xmlns:w="http://schemas.openxmlformats.org/wordprocessingml/2006/main" xmlns:w14="http://schemas.microsoft.com/office/word/2010/wordml" xmlns:w15="http://schemas.microsoft.com/office/word/2012/wordml" xmlns:w16cex="http://schemas.microsoft.com/office/word/2018/wordml/cex" xmlns:w16cid="http://schemas.microsoft.com/office/word/2016/wordml/cid" xmlns:w16="http://schemas.microsoft.com/office/word/2018/wordml" xmlns:w16du="http://schemas.microsoft.com/office/word/2023/wordml/word16du" xmlns:w16sdtdh="http://schemas.microsoft.com/office/word/2020/wordml/sdtdatahash" xmlns:w16sdtfl="http://schemas.microsoft.com/office/word/2024/wordml/sdtformatlock" xmlns:w16se="http://schemas.microsoft.com/office/word/2015/wordml/symex" xmlns:wpg="http://schemas.microsoft.com/office/word/2010/wordprocessingGroup" xmlns:wpi="http://schemas.microsoft.com/office/word/2010/wordprocessingInk" xmlns:wne="http://schemas.microsoft.com/office/word/2006/wordml" xmlns:wps="http://schemas.microsoft.com/office/word/2010/wordprocessingShape" mc:Ignorable="w14 w15 w16se w16cid w16 w16cex w16sdtdh w16sdtfl w16du wp14">
   <w:body>
     <w:p>
@@ -805,7 +887,7 @@
                 <w:w w:val="115"/>
                 <w:sz w:val="15"/>
               </w:rPr>
-              <w:t>{% for tp in tujuan_pembelajaran %}{{ tp.subject_name }}</w:t>
+              <w:t>{%tr for tp in tujuan_pembelajaran %}</w:t>
             </w:r>
           </w:p>
         </w:tc>
@@ -825,7 +907,101 @@
               <w:rPr>
                 <w:sz w:val="15"/>
               </w:rPr>
-              <w:t>{{ tp.tp }}{% endfor %}</w:t>
+              <w:t/>
+            </w:r>
+          </w:p>
+        </w:tc>
+      </w:tr>
+      <w:tr>
+        <w:trPr>
+          <w:trHeight w:val="394"/>
+        </w:trPr>
+        <w:tc>
+          <w:tcPr>
+            <w:tcW w:w="7208" w:type="dxa"/>
+          </w:tcPr>
+          <w:p>
+            <w:pPr>
+              <w:pStyle w:val="TableParagraph"/>
+              <w:ind w:left="14"/>
+              <w:rPr>
+                <w:sz w:val="15"/>
+              </w:rPr>
+            </w:pPr>
+            <w:r>
+              <w:rPr>
+                <w:spacing w:val="-2"/>
+                <w:w w:val="115"/>
+                <w:sz w:val="15"/>
+              </w:rPr>
+              <w:t>{{ tp.subject_name }}</w:t>
+            </w:r>
+          </w:p>
+        </w:tc>
+        <w:tc>
+          <w:tcPr>
+            <w:tcW w:w="8847" w:type="dxa"/>
+          </w:tcPr>
+          <w:p>
+            <w:pPr>
+              <w:pStyle w:val="TableParagraph"/>
+              <w:ind w:left="107"/>
+              <w:rPr>
+                <w:sz w:val="15"/>
+              </w:rPr>
+            </w:pPr>
+            <w:r>
+              <w:rPr>
+                <w:sz w:val="15"/>
+              </w:rPr>
+              <w:t>{{ tp.tp }}</w:t>
+            </w:r>
+          </w:p>
+        </w:tc>
+      </w:tr>
+      <w:tr>
+        <w:trPr>
+          <w:trHeight w:val="394"/>
+        </w:trPr>
+        <w:tc>
+          <w:tcPr>
+            <w:tcW w:w="7208" w:type="dxa"/>
+          </w:tcPr>
+          <w:p>
+            <w:pPr>
+              <w:pStyle w:val="TableParagraph"/>
+              <w:ind w:left="14"/>
+              <w:rPr>
+                <w:sz w:val="15"/>
+              </w:rPr>
+            </w:pPr>
+            <w:r>
+              <w:rPr>
+                <w:spacing w:val="-2"/>
+                <w:w w:val="115"/>
+                <w:sz w:val="15"/>
+              </w:rPr>
+              <w:t>{%tr endfor %}</w:t>
+            </w:r>
+          </w:p>
+        </w:tc>
+        <w:tc>
+          <w:tcPr>
+            <w:tcW w:w="8847" w:type="dxa"/>
+          </w:tcPr>
+          <w:p>
+            <w:pPr>
+              <w:pStyle w:val="TableParagraph"/>
+              <w:ind w:left="107"/>
+              <w:rPr>
+                <w:sz w:val="15"/>
+              </w:rPr>
+            </w:pPr>
+            <w:r>
+              <w:rPr>
+                <w:sz w:val="15"/>
+              </w:rPr>
+              <w:t/>
             </w:r>
           </w:p>
         </w:tc>
@@ -3139,7 +3315,7 @@
 </w:document>
 </file>
 
-<file path=word/endnotes.xml><?xml version="1.0" encoding="utf-8"?>
+<file path=word\endnotes.xml><?xml version="1.0" encoding="utf-8"?>
 <w:endnotes xmlns:wpc="http://schemas.microsoft.com/office/word/2010/wordprocessingCanvas" xmlns:cx="http://schemas.microsoft.com/office/drawing/2014/chartex" xmlns:cx1="http://schemas.microsoft.com/office/drawing/2015/9/8/chartex" xmlns:cx2="http://schemas.microsoft.com/office/drawing/2015/10/21/chartex" xmlns:cx3="http://schemas.microsoft.com/office/drawing/2016/5/9/chartex" xmlns:cx4="http://schemas.microsoft.com/office/drawing/2016/5/10/chartex" xmlns:cx5="http://schemas.microsoft.com/office/drawing/2016/5/11/chartex" xmlns:cx6="http://schemas.microsoft.com/office/drawing/2016/5/12/chartex" xmlns:cx7="http://schemas.microsoft.com/office/drawing/2016/5/13/chartex" xmlns:cx8="http://schemas.microsoft.com/office/drawing/2016/5/14/chartex" xmlns:mc="http://schemas.openxmlformats.org/markup-compatibility/2006" xmlns:aink="http://schemas.microsoft.com/office/drawing/2016/ink" xmlns:am3d="http://schemas.microsoft.com/office/drawing/2017/model3d" xmlns:o="urn:schemas-microsoft-com:office:office" xmlns:oel="http://schemas.microsoft.com/office/2019/extlst" xmlns:r="http://schemas.openxmlformats.org/officeDocument/2006/relationships" xmlns:m="http://schemas.openxmlformats.org/officeDocument/2006/math" xmlns:v="urn:schemas-microsoft-com:vml" xmlns:wp14="http://schemas.microsoft.com/office/word/2010/wordprocessingDrawing" xmlns:wp="http://schemas.openxmlformats.org/drawingml/2006/wordprocessingDrawing" xmlns:w10="urn:schemas-microsoft-com:office:word" xmlns:w="http://schemas.openxmlformats.org/wordprocessingml/2006/main" xmlns:w14="http://schemas.microsoft.com/office/word/2010/wordml" xmlns:w15="http://schemas.microsoft.com/office/word/2012/wordml" xmlns:w16cex="http://schemas.microsoft.com/office/word/2018/wordml/cex" xmlns:w16cid="http://schemas.microsoft.com/office/word/2016/wordml/cid" xmlns:w16="http://schemas.microsoft.com/office/word/2018/wordml" xmlns:w16du="http://schemas.microsoft.com/office/word/2023/wordml/word16du" xmlns:w16sdtdh="http://schemas.microsoft.com/office/word/2020/wordml/sdtdatahash" xmlns:w16sdtfl="http://schemas.microsoft.com/office/word/2024/wordml/sdtformatlock" xmlns:w16se="http://schemas.microsoft.com/office/word/2015/wordml/symex" xmlns:wpg="http://schemas.microsoft.com/office/word/2010/wordprocessingGroup" xmlns:wpi="http://schemas.microsoft.com/office/word/2010/wordprocessingInk" xmlns:wne="http://schemas.microsoft.com/office/word/2006/wordml" xmlns:wps="http://schemas.microsoft.com/office/word/2010/wordprocessingShape" mc:Ignorable="w14 w15 w16se w16cid w16 w16cex w16sdtdh w16sdtfl w16du wp14">
   <w:endnote w:type="separator" w:id="-1">
     <w:p>
@@ -3158,7 +3334,40 @@
 </w:endnotes>
 </file>
 
-<file path=word/footnotes.xml><?xml version="1.0" encoding="utf-8"?>
+<file path=word\fontTable.xml><?xml version="1.0" encoding="utf-8"?>
+<w:fonts xmlns:mc="http://schemas.openxmlformats.org/markup-compatibility/2006" xmlns:r="http://schemas.openxmlformats.org/officeDocument/2006/relationships" xmlns:w="http://schemas.openxmlformats.org/wordprocessingml/2006/main" xmlns:w14="http://schemas.microsoft.com/office/word/2010/wordml" xmlns:w15="http://schemas.microsoft.com/office/word/2012/wordml" xmlns:w16cex="http://schemas.microsoft.com/office/word/2018/wordml/cex" xmlns:w16cid="http://schemas.microsoft.com/office/word/2016/wordml/cid" xmlns:w16="http://schemas.microsoft.com/office/word/2018/wordml" xmlns:w16du="http://schemas.microsoft.com/office/word/2023/wordml/word16du" xmlns:w16sdtdh="http://schemas.microsoft.com/office/word/2020/wordml/sdtdatahash" xmlns:w16sdtfl="http://schemas.microsoft.com/office/word/2024/wordml/sdtformatlock" xmlns:w16se="http://schemas.microsoft.com/office/word/2015/wordml/symex" mc:Ignorable="w14 w15 w16se w16cid w16 w16cex w16sdtdh w16sdtfl w16du">
+  <w:font w:name="Calibri">
+    <w:panose1 w:val="020F0502020204030204"/>
+    <w:charset w:val="00"/>
+    <w:family w:val="swiss"/>
+    <w:pitch w:val="variable"/>
+    <w:sig w:usb0="E4002EFF" w:usb1="C200247B" w:usb2="00000009" w:usb3="00000000" w:csb0="000001FF" w:csb1="00000000"/>
+  </w:font>
+  <w:font w:name="Times New Roman">
+    <w:panose1 w:val="02020603050405020304"/>
+    <w:charset w:val="00"/>
+    <w:family w:val="roman"/>
+    <w:pitch w:val="variable"/>
+    <w:sig w:usb0="E0002EFF" w:usb1="C000785B" w:usb2="00000009" w:usb3="00000000" w:csb0="000001FF" w:csb1="00000000"/>
+  </w:font>
+  <w:font w:name="Trebuchet MS">
+    <w:panose1 w:val="020B0603020202020204"/>
+    <w:charset w:val="00"/>
+    <w:family w:val="swiss"/>
+    <w:pitch w:val="variable"/>
+    <w:sig w:usb0="00000687" w:usb1="00000000" w:usb2="00000000" w:usb3="00000000" w:csb0="0000009F" w:csb1="00000000"/>
+  </w:font>
+  <w:font w:name="Cambria">
+    <w:panose1 w:val="02040503050406030204"/>
+    <w:charset w:val="00"/>
+    <w:family w:val="roman"/>
+    <w:pitch w:val="variable"/>
+    <w:sig w:usb0="E00006FF" w:usb1="420024FF" w:usb2="02000000" w:usb3="00000000" w:csb0="0000019F" w:csb1="00000000"/>
+  </w:font>
+</w:fonts>
+</file>
+
+<file path=word\footnotes.xml><?xml version="1.0" encoding="utf-8"?>
 <w:footnotes xmlns:wpc="http://schemas.microsoft.com/office/word/2010/wordprocessingCanvas" xmlns:cx="http://schemas.microsoft.com/office/drawing/2014/chartex" xmlns:cx1="http://schemas.microsoft.com/office/drawing/2015/9/8/chartex" xmlns:cx2="http://schemas.microsoft.com/office/drawing/2015/10/21/chartex" xmlns:cx3="http://schemas.microsoft.com/office/drawing/2016/5/9/chartex" xmlns:cx4="http://schemas.microsoft.com/office/drawing/2016/5/10/chartex" xmlns:cx5="http://schemas.microsoft.com/office/drawing/2016/5/11/chartex" xmlns:cx6="http://schemas.microsoft.com/office/drawing/2016/5/12/chartex" xmlns:cx7="http://schemas.microsoft.com/office/drawing/2016/5/13/chartex" xmlns:cx8="http://schemas.microsoft.com/office/drawing/2016/5/14/chartex" xmlns:mc="http://schemas.openxmlformats.org/markup-compatibility/2006" xmlns:aink="http://schemas.microsoft.com/office/drawing/2016/ink" xmlns:am3d="http://schemas.microsoft.com/office/drawing/2017/model3d" xmlns:o="urn:schemas-microsoft-com:office:office" xmlns:oel="http://schemas.microsoft.com/office/2019/extlst" xmlns:r="http://schemas.openxmlformats.org/officeDocument/2006/relationships" xmlns:m="http://schemas.openxmlformats.org/officeDocument/2006/math" xmlns:v="urn:schemas-microsoft-com:vml" xmlns:wp14="http://schemas.microsoft.com/office/word/2010/wordprocessingDrawing" xmlns:wp="http://schemas.openxmlformats.org/drawingml/2006/wordprocessingDrawing" xmlns:w10="urn:schemas-microsoft-com:office:word" xmlns:w="http://schemas.openxmlformats.org/wordprocessingml/2006/main" xmlns:w14="http://schemas.microsoft.com/office/word/2010/wordml" xmlns:w15="http://schemas.microsoft.com/office/word/2012/wordml" xmlns:w16cex="http://schemas.microsoft.com/office/word/2018/wordml/cex" xmlns:w16cid="http://schemas.microsoft.com/office/word/2016/wordml/cid" xmlns:w16="http://schemas.microsoft.com/office/word/2018/wordml" xmlns:w16du="http://schemas.microsoft.com/office/word/2023/wordml/word16du" xmlns:w16sdtdh="http://schemas.microsoft.com/office/word/2020/wordml/sdtdatahash" xmlns:w16sdtfl="http://schemas.microsoft.com/office/word/2024/wordml/sdtformatlock" xmlns:w16se="http://schemas.microsoft.com/office/word/2015/wordml/symex" xmlns:wpg="http://schemas.microsoft.com/office/word/2010/wordprocessingGroup" xmlns:wpi="http://schemas.microsoft.com/office/word/2010/wordprocessingInk" xmlns:wne="http://schemas.microsoft.com/office/word/2006/wordml" xmlns:wps="http://schemas.microsoft.com/office/word/2010/wordprocessingShape" mc:Ignorable="w14 w15 w16se w16cid w16 w16cex w16sdtdh w16sdtfl w16du wp14">
   <w:footnote w:type="separator" w:id="-1">
     <w:p>
@@ -3177,7 +3386,74 @@
 </w:footnotes>
 </file>
 
-<file path=word/styles.xml><?xml version="1.0" encoding="utf-8"?>
+<file path=word\settings.xml><?xml version="1.0" encoding="utf-8"?>
+<w:settings xmlns:mc="http://schemas.openxmlformats.org/markup-compatibility/2006" xmlns:o="urn:schemas-microsoft-com:office:office" xmlns:r="http://schemas.openxmlformats.org/officeDocument/2006/relationships" xmlns:m="http://schemas.openxmlformats.org/officeDocument/2006/math" xmlns:v="urn:schemas-microsoft-com:vml" xmlns:w10="urn:schemas-microsoft-com:office:word" xmlns:w="http://schemas.openxmlformats.org/wordprocessingml/2006/main" xmlns:w14="http://schemas.microsoft.com/office/word/2010/wordml" xmlns:w15="http://schemas.microsoft.com/office/word/2012/wordml" xmlns:w16cex="http://schemas.microsoft.com/office/word/2018/wordml/cex" xmlns:w16cid="http://schemas.microsoft.com/office/word/2016/wordml/cid" xmlns:w16="http://schemas.microsoft.com/office/word/2018/wordml" xmlns:w16du="http://schemas.microsoft.com/office/word/2023/wordml/word16du" xmlns:w16sdtdh="http://schemas.microsoft.com/office/word/2020/wordml/sdtdatahash" xmlns:w16sdtfl="http://schemas.microsoft.com/office/word/2024/wordml/sdtformatlock" xmlns:w16se="http://schemas.microsoft.com/office/word/2015/wordml/symex" xmlns:sl="http://schemas.openxmlformats.org/schemaLibrary/2006/main" mc:Ignorable="w14 w15 w16se w16cid w16 w16cex w16sdtdh w16sdtfl w16du">
+  <w:zoom w:percent="100"/>
+  <w:proofState w:grammar="clean"/>
+  <w:defaultTabStop w:val="720"/>
+  <w:drawingGridHorizontalSpacing w:val="110"/>
+  <w:displayHorizontalDrawingGridEvery w:val="2"/>
+  <w:characterSpacingControl w:val="doNotCompress"/>
+  <w:footnotePr>
+    <w:footnote w:id="-1"/>
+    <w:footnote w:id="0"/>
+  </w:footnotePr>
+  <w:endnotePr>
+    <w:endnote w:id="-1"/>
+    <w:endnote w:id="0"/>
+  </w:endnotePr>
+  <w:compat>
+    <w:ulTrailSpace/>
+    <w:shapeLayoutLikeWW8/>
+    <w:compatSetting w:name="compatibilityMode" w:uri="http://schemas.microsoft.com/office/word" w:val="14"/>
+    <w:compatSetting w:name="useWord2013TrackBottomHyphenation" w:uri="http://schemas.microsoft.com/office/word" w:val="1"/>
+  </w:compat>
+  <w:rsids>
+    <w:rsidRoot w:val="00AE512A"/>
+    <w:rsid w:val="000C663A"/>
+    <w:rsid w:val="000E4877"/>
+    <w:rsid w:val="00350E31"/>
+    <w:rsid w:val="003F232B"/>
+    <w:rsid w:val="00403E08"/>
+    <w:rsid w:val="004C7EBB"/>
+    <w:rsid w:val="00593A15"/>
+    <w:rsid w:val="005A487D"/>
+    <w:rsid w:val="007C7ACC"/>
+    <w:rsid w:val="00816F1E"/>
+    <w:rsid w:val="008376D8"/>
+    <w:rsid w:val="00932FF5"/>
+    <w:rsid w:val="00AE512A"/>
+    <w:rsid w:val="00FB0408"/>
+  </w:rsids>
+  <m:mathPr>
+    <m:mathFont m:val="Cambria Math"/>
+    <m:brkBin m:val="before"/>
+    <m:brkBinSub m:val="--"/>
+    <m:smallFrac m:val="0"/>
+    <m:dispDef/>
+    <m:lMargin m:val="0"/>
+    <m:rMargin m:val="0"/>
+    <m:defJc m:val="centerGroup"/>
+    <m:wrapIndent m:val="1440"/>
+    <m:intLim m:val="subSup"/>
+    <m:naryLim m:val="undOvr"/>
+  </m:mathPr>
+  <w:themeFontLang w:val="en-US"/>
+  <w:clrSchemeMapping w:bg1="light1" w:t1="dark1" w:bg2="light2" w:t2="dark2" w:accent1="accent1" w:accent2="accent2" w:accent3="accent3" w:accent4="accent4" w:accent5="accent5" w:accent6="accent6" w:hyperlink="hyperlink" w:followedHyperlink="followedHyperlink"/>
+  <w:shapeDefaults>
+    <o:shapedefaults v:ext="edit" spidmax="1026"/>
+    <o:shapelayout v:ext="edit">
+      <o:idmap v:ext="edit" data="1"/>
+    </o:shapelayout>
+  </w:shapeDefaults>
+  <w:decimalSymbol w:val="."/>
+  <w:listSeparator w:val=","/>
+  <w14:docId w14:val="66311134"/>
+  <w15:docId w15:val="{1AD715A5-101C-451A-B811-8B77262BE58E}"/>
+</w:settings>
+</file>
+
+<file path=word\styles.xml><?xml version="1.0" encoding="utf-8"?>
 <w:styles xmlns:mc="http://schemas.openxmlformats.org/markup-compatibility/2006" xmlns:r="http://schemas.openxmlformats.org/officeDocument/2006/relationships" xmlns:w="http://schemas.openxmlformats.org/wordprocessingml/2006/main" xmlns:w14="http://schemas.microsoft.com/office/word/2010/wordml" xmlns:w15="http://schemas.microsoft.com/office/word/2012/wordml" xmlns:w16cex="http://schemas.microsoft.com/office/word/2018/wordml/cex" xmlns:w16cid="http://schemas.microsoft.com/office/word/2016/wordml/cid" xmlns:w16="http://schemas.microsoft.com/office/word/2018/wordml" xmlns:w16du="http://schemas.microsoft.com/office/word/2023/wordml/word16du" xmlns:w16sdtdh="http://schemas.microsoft.com/office/word/2020/wordml/sdtdatahash" xmlns:w16sdtfl="http://schemas.microsoft.com/office/word/2024/wordml/sdtformatlock" xmlns:w16se="http://schemas.microsoft.com/office/word/2015/wordml/symex" mc:Ignorable="w14 w15 w16se w16cid w16 w16cex w16sdtdh w16sdtfl w16du">
   <w:docDefaults>
     <w:rPrDefault>
@@ -3709,7 +3985,7 @@
 </w:styles>
 </file>
 
-<file path=word/theme/theme1.xml><?xml version="1.0" encoding="utf-8"?>
+<file path=word\theme\theme1.xml><?xml version="1.0" encoding="utf-8"?>
 <a:theme xmlns:a="http://schemas.openxmlformats.org/drawingml/2006/main" name="Office Theme">
   <a:themeElements>
     <a:clrScheme name="Office">
@@ -3992,14 +4268,6 @@
 </a:theme>
 </file>
 
-<file path=customXml/item1.xml><?xml version="1.0" encoding="utf-8"?>
-<b:Sources xmlns:b="http://schemas.openxmlformats.org/officeDocument/2006/bibliography" xmlns="http://schemas.openxmlformats.org/officeDocument/2006/bibliography" SelectedStyle="\APASixthEditionOfficeOnline.xsl" StyleName="APA" Version="6"/>
-</file>
-
-<file path=customXml/itemProps1.xml><?xml version="1.0" encoding="utf-8"?>
-<ds:datastoreItem xmlns:ds="http://schemas.openxmlformats.org/officeDocument/2006/customXml" ds:itemID="{180C964A-8B4F-403A-92FC-EA381371D074}">
-  <ds:schemaRefs>
-    <ds:schemaRef ds:uri="http://schemas.openxmlformats.org/officeDocument/2006/bibliography"/>
-  </ds:schemaRefs>
-</ds:datastoreItem>
+<file path=word\webSettings.xml><?xml version="1.0" encoding="utf-8"?>
+<w:webSettings xmlns:mc="http://schemas.openxmlformats.org/markup-compatibility/2006" xmlns:r="http://schemas.openxmlformats.org/officeDocument/2006/relationships" xmlns:w="http://schemas.openxmlformats.org/wordprocessingml/2006/main" xmlns:w14="http://schemas.microsoft.com/office/word/2010/wordml" xmlns:w15="http://schemas.microsoft.com/office/word/2012/wordml" xmlns:w16cex="http://schemas.microsoft.com/office/word/2018/wordml/cex" xmlns:w16cid="http://schemas.microsoft.com/office/word/2016/wordml/cid" xmlns:w16="http://schemas.microsoft.com/office/word/2018/wordml" xmlns:w16du="http://schemas.microsoft.com/office/word/2023/wordml/word16du" xmlns:w16sdtdh="http://schemas.microsoft.com/office/word/2020/wordml/sdtdatahash" xmlns:w16sdtfl="http://schemas.microsoft.com/office/word/2024/wordml/sdtformatlock" xmlns:w16se="http://schemas.microsoft.com/office/word/2015/wordml/symex" mc:Ignorable="w14 w15 w16se w16cid w16 w16cex w16sdtdh w16sdtfl w16du"/>
 </file>
</xml_diff>